<commit_message>
Incluindo versão para funcionar no OSx: 2022-01-07.
</commit_message>
<xml_diff>
--- a/códigos/SmartEDA.docx
+++ b/códigos/SmartEDA.docx
@@ -7,11 +7,13 @@
         <w:pStyle w:val="Title"/>
       </w:pPr>
       <w:r>
-        <w:t xml:space="preserve">SmartEDA:</w:t>
-      </w:r>
-      <w:r>
-        <w:t xml:space="preserve"> </w:t>
-      </w:r>
+        <w:t xml:space="preserve">SmartEDA</w:t>
+      </w:r>
+    </w:p>
+    <w:p>
+      <w:pPr>
+        <w:pStyle w:val="Subtitle"/>
+      </w:pPr>
       <w:r>
         <w:t xml:space="preserve">Um</w:t>
       </w:r>
@@ -81,11 +83,13 @@
         <w:t xml:space="preserve"> </w:t>
       </w:r>
       <w:r>
-        <w:t xml:space="preserve">Putatunda;</w:t>
-      </w:r>
-      <w:r>
-        <w:t xml:space="preserve"> </w:t>
-      </w:r>
+        <w:t xml:space="preserve">Putatunda</w:t>
+      </w:r>
+    </w:p>
+    <w:p>
+      <w:pPr>
+        <w:pStyle w:val="Author"/>
+      </w:pPr>
       <w:r>
         <w:t xml:space="preserve">Dayananda</w:t>
       </w:r>
@@ -93,11 +97,13 @@
         <w:t xml:space="preserve"> </w:t>
       </w:r>
       <w:r>
-        <w:t xml:space="preserve">Ubrangala;</w:t>
-      </w:r>
-      <w:r>
-        <w:t xml:space="preserve"> </w:t>
-      </w:r>
+        <w:t xml:space="preserve">Ubrangala</w:t>
+      </w:r>
+    </w:p>
+    <w:p>
+      <w:pPr>
+        <w:pStyle w:val="Author"/>
+      </w:pPr>
       <w:r>
         <w:t xml:space="preserve">Kiran</w:t>
       </w:r>
@@ -105,11 +111,13 @@
         <w:t xml:space="preserve"> </w:t>
       </w:r>
       <w:r>
-        <w:t xml:space="preserve">Rama;</w:t>
-      </w:r>
-      <w:r>
-        <w:t xml:space="preserve"> </w:t>
-      </w:r>
+        <w:t xml:space="preserve">Rama</w:t>
+      </w:r>
+    </w:p>
+    <w:p>
+      <w:pPr>
+        <w:pStyle w:val="Author"/>
+      </w:pPr>
       <w:r>
         <w:t xml:space="preserve">Ravi</w:t>
       </w:r>
@@ -125,7 +133,7 @@
         <w:pStyle w:val="Date"/>
       </w:pPr>
       <w:r>
-        <w:t xml:space="preserve">04/01/2023</w:t>
+        <w:t xml:space="preserve">07/01/2023</w:t>
       </w:r>
     </w:p>
     <w:bookmarkStart w:id="20" w:name="introdução-análise-exploratória-de-dados"/>
@@ -336,7 +344,7 @@
       </w:r>
     </w:p>
     <w:bookmarkEnd w:id="20"/>
-    <w:bookmarkStart w:id="21" w:name="principal-funcionalidade"/>
+    <w:bookmarkStart w:id="24" w:name="principal-funcionalidade"/>
     <w:p>
       <w:pPr>
         <w:pStyle w:val="Heading3"/>
@@ -412,17 +420,59 @@
         <w:pStyle w:val="BodyText"/>
       </w:pPr>
       <w:r>
-        <w:t xml:space="preserve">[./figuras/Figura 1 Funcionalidades SmarEDA.jpg]</w:t>
-      </w:r>
-      <w:r>
-        <w:br/>
+        <w:t xml:space="preserve">#</w:t>
       </w:r>
       <w:r>
         <w:t xml:space="preserve">Figura 1: As diversas funcionalidades do SmartEDA.</w:t>
       </w:r>
-    </w:p>
-    <w:bookmarkEnd w:id="21"/>
-    <w:bookmarkStart w:id="22" w:name="ilustração"/>
+      <w:r>
+        <w:t xml:space="preserve"> </w:t>
+      </w:r>
+      <w:r>
+        <w:drawing>
+          <wp:inline>
+            <wp:extent cx="5334000" cy="2794373"/>
+            <wp:effectExtent b="0" l="0" r="0" t="0"/>
+            <wp:docPr descr="Figura 1: As diversas funcionalidades do SmartEDA." title="" id="22" name="Picture"/>
+            <a:graphic>
+              <a:graphicData uri="http://schemas.openxmlformats.org/drawingml/2006/picture">
+                <pic:pic>
+                  <pic:nvPicPr>
+                    <pic:cNvPr descr="/Users/jpalbino/Library/Mobile%20Documents/com~apple~CloudDocs/GitHub/with-a-little-help-from-my-friends/figuras/EDA-Funcionalidades-SmartEDA.jpg" id="23" name="Picture"/>
+                    <pic:cNvPicPr>
+                      <a:picLocks noChangeArrowheads="1" noChangeAspect="1"/>
+                    </pic:cNvPicPr>
+                  </pic:nvPicPr>
+                  <pic:blipFill>
+                    <a:blip r:embed="rId21"/>
+                    <a:stretch>
+                      <a:fillRect/>
+                    </a:stretch>
+                  </pic:blipFill>
+                  <pic:spPr bwMode="auto">
+                    <a:xfrm>
+                      <a:off x="0" y="0"/>
+                      <a:ext cx="5334000" cy="2794373"/>
+                    </a:xfrm>
+                    <a:prstGeom prst="rect">
+                      <a:avLst/>
+                    </a:prstGeom>
+                    <a:noFill/>
+                    <a:ln w="9525">
+                      <a:noFill/>
+                      <a:headEnd/>
+                      <a:tailEnd/>
+                    </a:ln>
+                  </pic:spPr>
+                </pic:pic>
+              </a:graphicData>
+            </a:graphic>
+          </wp:inline>
+        </w:drawing>
+      </w:r>
+    </w:p>
+    <w:bookmarkEnd w:id="24"/>
+    <w:bookmarkStart w:id="25" w:name="ilustração"/>
     <w:p>
       <w:pPr>
         <w:pStyle w:val="Heading3"/>
@@ -477,24 +527,625 @@
       </w:pPr>
       <w:r>
         <w:rPr>
+          <w:rStyle w:val="ControlFlowTok"/>
+        </w:rPr>
+        <w:t xml:space="preserve">if</w:t>
+      </w:r>
+      <w:r>
+        <w:rPr>
+          <w:rStyle w:val="NormalTok"/>
+        </w:rPr>
+        <w:t xml:space="preserve">(</w:t>
+      </w:r>
+      <w:r>
+        <w:rPr>
+          <w:rStyle w:val="SpecialCharTok"/>
+        </w:rPr>
+        <w:t xml:space="preserve">!</w:t>
+      </w:r>
+      <w:r>
+        <w:rPr>
+          <w:rStyle w:val="NormalTok"/>
+        </w:rPr>
+        <w:t xml:space="preserve">(</w:t>
+      </w:r>
+      <w:r>
+        <w:rPr>
+          <w:rStyle w:val="StringTok"/>
+        </w:rPr>
+        <w:t xml:space="preserve">"SmartEDA"</w:t>
+      </w:r>
+      <w:r>
+        <w:rPr>
+          <w:rStyle w:val="NormalTok"/>
+        </w:rPr>
+        <w:t xml:space="preserve">) </w:t>
+      </w:r>
+      <w:r>
+        <w:rPr>
+          <w:rStyle w:val="SpecialCharTok"/>
+        </w:rPr>
+        <w:t xml:space="preserve">%in%</w:t>
+      </w:r>
+      <w:r>
+        <w:rPr>
+          <w:rStyle w:val="NormalTok"/>
+        </w:rPr>
+        <w:t xml:space="preserve"> </w:t>
+      </w:r>
+      <w:r>
+        <w:rPr>
+          <w:rStyle w:val="FunctionTok"/>
+        </w:rPr>
+        <w:t xml:space="preserve">installed.packages</w:t>
+      </w:r>
+      <w:r>
+        <w:rPr>
+          <w:rStyle w:val="NormalTok"/>
+        </w:rPr>
+        <w:t xml:space="preserve">()) </w:t>
+      </w:r>
+      <w:r>
+        <w:rPr>
+          <w:rStyle w:val="FunctionTok"/>
+        </w:rPr>
+        <w:t xml:space="preserve">install.packages</w:t>
+      </w:r>
+      <w:r>
+        <w:rPr>
+          <w:rStyle w:val="NormalTok"/>
+        </w:rPr>
+        <w:t xml:space="preserve">(</w:t>
+      </w:r>
+      <w:r>
+        <w:rPr>
+          <w:rStyle w:val="StringTok"/>
+        </w:rPr>
+        <w:t xml:space="preserve">"SmartEDA"</w:t>
+      </w:r>
+      <w:r>
+        <w:rPr>
+          <w:rStyle w:val="NormalTok"/>
+        </w:rPr>
+        <w:t xml:space="preserve">)</w:t>
+      </w:r>
+      <w:r>
+        <w:br/>
+      </w:r>
+      <w:r>
+        <w:rPr>
+          <w:rStyle w:val="FunctionTok"/>
+        </w:rPr>
+        <w:t xml:space="preserve">library</w:t>
+      </w:r>
+      <w:r>
+        <w:rPr>
+          <w:rStyle w:val="NormalTok"/>
+        </w:rPr>
+        <w:t xml:space="preserve">(SmartEDA)</w:t>
+      </w:r>
+    </w:p>
+    <w:p>
+      <w:pPr>
+        <w:pStyle w:val="SourceCode"/>
+      </w:pPr>
+      <w:r>
+        <w:rPr>
+          <w:rStyle w:val="VerbatimChar"/>
+        </w:rPr>
+        <w:t xml:space="preserve">## Registered S3 method overwritten by 'GGally':</w:t>
+      </w:r>
+      <w:r>
+        <w:br/>
+      </w:r>
+      <w:r>
+        <w:rPr>
+          <w:rStyle w:val="VerbatimChar"/>
+        </w:rPr>
+        <w:t xml:space="preserve">##   method from   </w:t>
+      </w:r>
+      <w:r>
+        <w:br/>
+      </w:r>
+      <w:r>
+        <w:rPr>
+          <w:rStyle w:val="VerbatimChar"/>
+        </w:rPr>
+        <w:t xml:space="preserve">##   +.gg   ggplot2</w:t>
+      </w:r>
+    </w:p>
+    <w:p>
+      <w:pPr>
+        <w:pStyle w:val="SourceCode"/>
+      </w:pPr>
+      <w:r>
+        <w:rPr>
+          <w:rStyle w:val="ControlFlowTok"/>
+        </w:rPr>
+        <w:t xml:space="preserve">if</w:t>
+      </w:r>
+      <w:r>
+        <w:rPr>
+          <w:rStyle w:val="NormalTok"/>
+        </w:rPr>
+        <w:t xml:space="preserve">(</w:t>
+      </w:r>
+      <w:r>
+        <w:rPr>
+          <w:rStyle w:val="SpecialCharTok"/>
+        </w:rPr>
+        <w:t xml:space="preserve">!</w:t>
+      </w:r>
+      <w:r>
+        <w:rPr>
+          <w:rStyle w:val="NormalTok"/>
+        </w:rPr>
+        <w:t xml:space="preserve">(</w:t>
+      </w:r>
+      <w:r>
+        <w:rPr>
+          <w:rStyle w:val="StringTok"/>
+        </w:rPr>
+        <w:t xml:space="preserve">"ISLR"</w:t>
+      </w:r>
+      <w:r>
+        <w:rPr>
+          <w:rStyle w:val="NormalTok"/>
+        </w:rPr>
+        <w:t xml:space="preserve">) </w:t>
+      </w:r>
+      <w:r>
+        <w:rPr>
+          <w:rStyle w:val="SpecialCharTok"/>
+        </w:rPr>
+        <w:t xml:space="preserve">%in%</w:t>
+      </w:r>
+      <w:r>
+        <w:rPr>
+          <w:rStyle w:val="NormalTok"/>
+        </w:rPr>
+        <w:t xml:space="preserve"> </w:t>
+      </w:r>
+      <w:r>
+        <w:rPr>
+          <w:rStyle w:val="FunctionTok"/>
+        </w:rPr>
+        <w:t xml:space="preserve">installed.packages</w:t>
+      </w:r>
+      <w:r>
+        <w:rPr>
+          <w:rStyle w:val="NormalTok"/>
+        </w:rPr>
+        <w:t xml:space="preserve">()) </w:t>
+      </w:r>
+      <w:r>
+        <w:rPr>
+          <w:rStyle w:val="FunctionTok"/>
+        </w:rPr>
+        <w:t xml:space="preserve">install.packages</w:t>
+      </w:r>
+      <w:r>
+        <w:rPr>
+          <w:rStyle w:val="NormalTok"/>
+        </w:rPr>
+        <w:t xml:space="preserve">(</w:t>
+      </w:r>
+      <w:r>
+        <w:rPr>
+          <w:rStyle w:val="StringTok"/>
+        </w:rPr>
+        <w:t xml:space="preserve">"ISLR"</w:t>
+      </w:r>
+      <w:r>
+        <w:rPr>
+          <w:rStyle w:val="NormalTok"/>
+        </w:rPr>
+        <w:t xml:space="preserve">)</w:t>
+      </w:r>
+      <w:r>
+        <w:br/>
+      </w:r>
+      <w:r>
+        <w:rPr>
+          <w:rStyle w:val="FunctionTok"/>
+        </w:rPr>
+        <w:t xml:space="preserve">library</w:t>
+      </w:r>
+      <w:r>
+        <w:rPr>
+          <w:rStyle w:val="NormalTok"/>
+        </w:rPr>
+        <w:t xml:space="preserve">(</w:t>
+      </w:r>
+      <w:r>
+        <w:rPr>
+          <w:rStyle w:val="StringTok"/>
+        </w:rPr>
+        <w:t xml:space="preserve">"ISLR"</w:t>
+      </w:r>
+      <w:r>
+        <w:rPr>
+          <w:rStyle w:val="NormalTok"/>
+        </w:rPr>
+        <w:t xml:space="preserve">)</w:t>
+      </w:r>
+    </w:p>
+    <w:p>
+      <w:pPr>
+        <w:pStyle w:val="FirstParagraph"/>
+      </w:pPr>
+      <w:r>
+        <w:t xml:space="preserve">Agora usaremos o SmartEDA para compreender: as dimensões do conjunto de dados, os nomes e tipos de dados de cada variável e observar um resumo geral de dados ausentes (missing data) .</w:t>
+      </w:r>
+    </w:p>
+    <w:p>
+      <w:pPr>
+        <w:pStyle w:val="SourceCode"/>
+      </w:pPr>
+      <w:r>
+        <w:rPr>
+          <w:rStyle w:val="NormalTok"/>
+        </w:rPr>
+        <w:t xml:space="preserve">Carseats </w:t>
+      </w:r>
+      <w:r>
+        <w:rPr>
+          <w:rStyle w:val="OtherTok"/>
+        </w:rPr>
+        <w:t xml:space="preserve">&lt;-</w:t>
+      </w:r>
+      <w:r>
+        <w:rPr>
+          <w:rStyle w:val="NormalTok"/>
+        </w:rPr>
+        <w:t xml:space="preserve"> ISLR</w:t>
+      </w:r>
+      <w:r>
+        <w:rPr>
+          <w:rStyle w:val="SpecialCharTok"/>
+        </w:rPr>
+        <w:t xml:space="preserve">::</w:t>
+      </w:r>
+      <w:r>
+        <w:rPr>
+          <w:rStyle w:val="NormalTok"/>
+        </w:rPr>
+        <w:t xml:space="preserve">Carseats</w:t>
+      </w:r>
+      <w:r>
+        <w:br/>
+      </w:r>
+      <w:r>
+        <w:rPr>
+          <w:rStyle w:val="FunctionTok"/>
+        </w:rPr>
+        <w:t xml:space="preserve">ExpData</w:t>
+      </w:r>
+      <w:r>
+        <w:rPr>
+          <w:rStyle w:val="NormalTok"/>
+        </w:rPr>
+        <w:t xml:space="preserve">(</w:t>
+      </w:r>
+      <w:r>
+        <w:rPr>
+          <w:rStyle w:val="AttributeTok"/>
+        </w:rPr>
+        <w:t xml:space="preserve">data=</w:t>
+      </w:r>
+      <w:r>
+        <w:rPr>
+          <w:rStyle w:val="NormalTok"/>
+        </w:rPr>
+        <w:t xml:space="preserve">Carseats,</w:t>
+      </w:r>
+      <w:r>
+        <w:rPr>
+          <w:rStyle w:val="AttributeTok"/>
+        </w:rPr>
+        <w:t xml:space="preserve">type=</w:t>
+      </w:r>
+      <w:r>
+        <w:rPr>
+          <w:rStyle w:val="DecValTok"/>
+        </w:rPr>
+        <w:t xml:space="preserve">1</w:t>
+      </w:r>
+      <w:r>
+        <w:rPr>
+          <w:rStyle w:val="NormalTok"/>
+        </w:rPr>
+        <w:t xml:space="preserve">)</w:t>
+      </w:r>
+    </w:p>
+    <w:p>
+      <w:pPr>
+        <w:pStyle w:val="SourceCode"/>
+      </w:pPr>
+      <w:r>
+        <w:rPr>
+          <w:rStyle w:val="VerbatimChar"/>
+        </w:rPr>
+        <w:t xml:space="preserve">##                                           Descriptions     Value</w:t>
+      </w:r>
+      <w:r>
+        <w:br/>
+      </w:r>
+      <w:r>
+        <w:rPr>
+          <w:rStyle w:val="VerbatimChar"/>
+        </w:rPr>
+        <w:t xml:space="preserve">## 1                                   Sample size (nrow)       400</w:t>
+      </w:r>
+      <w:r>
+        <w:br/>
+      </w:r>
+      <w:r>
+        <w:rPr>
+          <w:rStyle w:val="VerbatimChar"/>
+        </w:rPr>
+        <w:t xml:space="preserve">## 2                              No. of variables (ncol)        11</w:t>
+      </w:r>
+      <w:r>
+        <w:br/>
+      </w:r>
+      <w:r>
+        <w:rPr>
+          <w:rStyle w:val="VerbatimChar"/>
+        </w:rPr>
+        <w:t xml:space="preserve">## 3                    No. of numeric/interger variables         8</w:t>
+      </w:r>
+      <w:r>
+        <w:br/>
+      </w:r>
+      <w:r>
+        <w:rPr>
+          <w:rStyle w:val="VerbatimChar"/>
+        </w:rPr>
+        <w:t xml:space="preserve">## 4                              No. of factor variables         3</w:t>
+      </w:r>
+      <w:r>
+        <w:br/>
+      </w:r>
+      <w:r>
+        <w:rPr>
+          <w:rStyle w:val="VerbatimChar"/>
+        </w:rPr>
+        <w:t xml:space="preserve">## 5                                No. of text variables         0</w:t>
+      </w:r>
+      <w:r>
+        <w:br/>
+      </w:r>
+      <w:r>
+        <w:rPr>
+          <w:rStyle w:val="VerbatimChar"/>
+        </w:rPr>
+        <w:t xml:space="preserve">## 6                             No. of logical variables         0</w:t>
+      </w:r>
+      <w:r>
+        <w:br/>
+      </w:r>
+      <w:r>
+        <w:rPr>
+          <w:rStyle w:val="VerbatimChar"/>
+        </w:rPr>
+        <w:t xml:space="preserve">## 7                          No. of identifier variables         0</w:t>
+      </w:r>
+      <w:r>
+        <w:br/>
+      </w:r>
+      <w:r>
+        <w:rPr>
+          <w:rStyle w:val="VerbatimChar"/>
+        </w:rPr>
+        <w:t xml:space="preserve">## 8                                No. of date variables         0</w:t>
+      </w:r>
+      <w:r>
+        <w:br/>
+      </w:r>
+      <w:r>
+        <w:rPr>
+          <w:rStyle w:val="VerbatimChar"/>
+        </w:rPr>
+        <w:t xml:space="preserve">## 9             No. of zero variance variables (uniform)         0</w:t>
+      </w:r>
+      <w:r>
+        <w:br/>
+      </w:r>
+      <w:r>
+        <w:rPr>
+          <w:rStyle w:val="VerbatimChar"/>
+        </w:rPr>
+        <w:t xml:space="preserve">## 10               %. of variables having complete cases 100% (11)</w:t>
+      </w:r>
+      <w:r>
+        <w:br/>
+      </w:r>
+      <w:r>
+        <w:rPr>
+          <w:rStyle w:val="VerbatimChar"/>
+        </w:rPr>
+        <w:t xml:space="preserve">## 11   %. of variables having &gt;0% and &lt;50% missing cases    0% (0)</w:t>
+      </w:r>
+      <w:r>
+        <w:br/>
+      </w:r>
+      <w:r>
+        <w:rPr>
+          <w:rStyle w:val="VerbatimChar"/>
+        </w:rPr>
+        <w:t xml:space="preserve">## 12 %. of variables having &gt;=50% and &lt;90% missing cases    0% (0)</w:t>
+      </w:r>
+      <w:r>
+        <w:br/>
+      </w:r>
+      <w:r>
+        <w:rPr>
+          <w:rStyle w:val="VerbatimChar"/>
+        </w:rPr>
+        <w:t xml:space="preserve">## 13          %. of variables having &gt;=90% missing cases    0% (0)</w:t>
+      </w:r>
+    </w:p>
+    <w:p>
+      <w:pPr>
+        <w:pStyle w:val="SourceCode"/>
+      </w:pPr>
+      <w:r>
+        <w:rPr>
           <w:rStyle w:val="CommentTok"/>
         </w:rPr>
-        <w:t xml:space="preserve">#if(!SmartEDA %in% installed.packages()) install.packages("SmartEDA")</w:t>
-      </w:r>
-      <w:r>
-        <w:br/>
-      </w:r>
+        <w:t xml:space="preserve"># saída</w:t>
+      </w:r>
+    </w:p>
+    <w:p>
+      <w:pPr>
+        <w:pStyle w:val="FirstParagraph"/>
+      </w:pPr>
+      <w:r>
+        <w:t xml:space="preserve">Agora, vejamos o resumo das variáveis numéricas/inteiras, como Advertising, Age,CompPrice, Income, Population, Price e Sales.</w:t>
+      </w:r>
+    </w:p>
+    <w:p>
+      <w:pPr>
+        <w:pStyle w:val="SourceCode"/>
+      </w:pPr>
       <w:r>
         <w:rPr>
           <w:rStyle w:val="FunctionTok"/>
         </w:rPr>
-        <w:t xml:space="preserve">library</w:t>
+        <w:t xml:space="preserve">ExpNumStat</w:t>
       </w:r>
       <w:r>
         <w:rPr>
           <w:rStyle w:val="NormalTok"/>
         </w:rPr>
-        <w:t xml:space="preserve">(SmartEDA)</w:t>
+        <w:t xml:space="preserve">(Carseats,</w:t>
+      </w:r>
+      <w:r>
+        <w:rPr>
+          <w:rStyle w:val="AttributeTok"/>
+        </w:rPr>
+        <w:t xml:space="preserve">by=</w:t>
+      </w:r>
+      <w:r>
+        <w:rPr>
+          <w:rStyle w:val="StringTok"/>
+        </w:rPr>
+        <w:t xml:space="preserve">"A"</w:t>
+      </w:r>
+      <w:r>
+        <w:rPr>
+          <w:rStyle w:val="NormalTok"/>
+        </w:rPr>
+        <w:t xml:space="preserve">,</w:t>
+      </w:r>
+      <w:r>
+        <w:rPr>
+          <w:rStyle w:val="AttributeTok"/>
+        </w:rPr>
+        <w:t xml:space="preserve">gp=</w:t>
+      </w:r>
+      <w:r>
+        <w:rPr>
+          <w:rStyle w:val="ConstantTok"/>
+        </w:rPr>
+        <w:t xml:space="preserve">NULL</w:t>
+      </w:r>
+      <w:r>
+        <w:rPr>
+          <w:rStyle w:val="NormalTok"/>
+        </w:rPr>
+        <w:t xml:space="preserve">,</w:t>
+      </w:r>
+      <w:r>
+        <w:rPr>
+          <w:rStyle w:val="AttributeTok"/>
+        </w:rPr>
+        <w:t xml:space="preserve">Qnt=</w:t>
+      </w:r>
+      <w:r>
+        <w:rPr>
+          <w:rStyle w:val="ConstantTok"/>
+        </w:rPr>
+        <w:t xml:space="preserve">NULL</w:t>
+      </w:r>
+      <w:r>
+        <w:rPr>
+          <w:rStyle w:val="NormalTok"/>
+        </w:rPr>
+        <w:t xml:space="preserve">,</w:t>
+      </w:r>
+      <w:r>
+        <w:rPr>
+          <w:rStyle w:val="AttributeTok"/>
+        </w:rPr>
+        <w:t xml:space="preserve">MesofShape=</w:t>
+      </w:r>
+      <w:r>
+        <w:rPr>
+          <w:rStyle w:val="DecValTok"/>
+        </w:rPr>
+        <w:t xml:space="preserve">2</w:t>
+      </w:r>
+      <w:r>
+        <w:rPr>
+          <w:rStyle w:val="NormalTok"/>
+        </w:rPr>
+        <w:t xml:space="preserve">, </w:t>
+      </w:r>
+      <w:r>
+        <w:rPr>
+          <w:rStyle w:val="AttributeTok"/>
+        </w:rPr>
+        <w:t xml:space="preserve">Outlier=</w:t>
+      </w:r>
+      <w:r>
+        <w:rPr>
+          <w:rStyle w:val="ConstantTok"/>
+        </w:rPr>
+        <w:t xml:space="preserve">FALSE</w:t>
+      </w:r>
+      <w:r>
+        <w:rPr>
+          <w:rStyle w:val="NormalTok"/>
+        </w:rPr>
+        <w:t xml:space="preserve">,</w:t>
+      </w:r>
+      <w:r>
+        <w:rPr>
+          <w:rStyle w:val="AttributeTok"/>
+        </w:rPr>
+        <w:t xml:space="preserve">round=</w:t>
+      </w:r>
+      <w:r>
+        <w:rPr>
+          <w:rStyle w:val="DecValTok"/>
+        </w:rPr>
+        <w:t xml:space="preserve">2</w:t>
+      </w:r>
+      <w:r>
+        <w:rPr>
+          <w:rStyle w:val="NormalTok"/>
+        </w:rPr>
+        <w:t xml:space="preserve">,</w:t>
+      </w:r>
+      <w:r>
+        <w:rPr>
+          <w:rStyle w:val="AttributeTok"/>
+        </w:rPr>
+        <w:t xml:space="preserve">Nlim=</w:t>
+      </w:r>
+      <w:r>
+        <w:rPr>
+          <w:rStyle w:val="DecValTok"/>
+        </w:rPr>
+        <w:t xml:space="preserve">10</w:t>
+      </w:r>
+      <w:r>
+        <w:rPr>
+          <w:rStyle w:val="NormalTok"/>
+        </w:rPr>
+        <w:t xml:space="preserve">)</w:t>
       </w:r>
     </w:p>
     <w:p>
@@ -505,25 +1156,142 @@
         <w:rPr>
           <w:rStyle w:val="VerbatimChar"/>
         </w:rPr>
-        <w:t xml:space="preserve">## Registered S3 method overwritten by 'GGally':</w:t>
-      </w:r>
-      <w:r>
-        <w:br/>
-      </w:r>
-      <w:r>
-        <w:rPr>
-          <w:rStyle w:val="VerbatimChar"/>
-        </w:rPr>
-        <w:t xml:space="preserve">##   method from   </w:t>
-      </w:r>
-      <w:r>
-        <w:br/>
-      </w:r>
-      <w:r>
-        <w:rPr>
-          <w:rStyle w:val="VerbatimChar"/>
-        </w:rPr>
-        <w:t xml:space="preserve">##   +.gg   ggplot2</w:t>
+        <w:t xml:space="preserve">##         Vname Group  TN nNeg nZero nPos NegInf PosInf NA_Value Per_of_Missing</w:t>
+      </w:r>
+      <w:r>
+        <w:br/>
+      </w:r>
+      <w:r>
+        <w:rPr>
+          <w:rStyle w:val="VerbatimChar"/>
+        </w:rPr>
+        <w:t xml:space="preserve">## 4 Advertising   All 400    0   144  256      0      0        0              0</w:t>
+      </w:r>
+      <w:r>
+        <w:br/>
+      </w:r>
+      <w:r>
+        <w:rPr>
+          <w:rStyle w:val="VerbatimChar"/>
+        </w:rPr>
+        <w:t xml:space="preserve">## 7         Age   All 400    0     0  400      0      0        0              0</w:t>
+      </w:r>
+      <w:r>
+        <w:br/>
+      </w:r>
+      <w:r>
+        <w:rPr>
+          <w:rStyle w:val="VerbatimChar"/>
+        </w:rPr>
+        <w:t xml:space="preserve">## 2   CompPrice   All 400    0     0  400      0      0        0              0</w:t>
+      </w:r>
+      <w:r>
+        <w:br/>
+      </w:r>
+      <w:r>
+        <w:rPr>
+          <w:rStyle w:val="VerbatimChar"/>
+        </w:rPr>
+        <w:t xml:space="preserve">## 3      Income   All 400    0     0  400      0      0        0              0</w:t>
+      </w:r>
+      <w:r>
+        <w:br/>
+      </w:r>
+      <w:r>
+        <w:rPr>
+          <w:rStyle w:val="VerbatimChar"/>
+        </w:rPr>
+        <w:t xml:space="preserve">## 5  Population   All 400    0     0  400      0      0        0              0</w:t>
+      </w:r>
+      <w:r>
+        <w:br/>
+      </w:r>
+      <w:r>
+        <w:rPr>
+          <w:rStyle w:val="VerbatimChar"/>
+        </w:rPr>
+        <w:t xml:space="preserve">## 6       Price   All 400    0     0  400      0      0        0              0</w:t>
+      </w:r>
+      <w:r>
+        <w:br/>
+      </w:r>
+      <w:r>
+        <w:rPr>
+          <w:rStyle w:val="VerbatimChar"/>
+        </w:rPr>
+        <w:t xml:space="preserve">## 1       Sales   All 400    0     1  399      0      0        0              0</w:t>
+      </w:r>
+      <w:r>
+        <w:br/>
+      </w:r>
+      <w:r>
+        <w:rPr>
+          <w:rStyle w:val="VerbatimChar"/>
+        </w:rPr>
+        <w:t xml:space="preserve">##         sum min    max   mean median     SD   CV    IQR Skewness Kurtosis</w:t>
+      </w:r>
+      <w:r>
+        <w:br/>
+      </w:r>
+      <w:r>
+        <w:rPr>
+          <w:rStyle w:val="VerbatimChar"/>
+        </w:rPr>
+        <w:t xml:space="preserve">## 4   2654.00   0  29.00   6.64   5.00   6.65 1.00  12.00     0.64    -0.55</w:t>
+      </w:r>
+      <w:r>
+        <w:br/>
+      </w:r>
+      <w:r>
+        <w:rPr>
+          <w:rStyle w:val="VerbatimChar"/>
+        </w:rPr>
+        <w:t xml:space="preserve">## 7  21329.00  25  80.00  53.32  54.50  16.20 0.30  26.25    -0.08    -1.14</w:t>
+      </w:r>
+      <w:r>
+        <w:br/>
+      </w:r>
+      <w:r>
+        <w:rPr>
+          <w:rStyle w:val="VerbatimChar"/>
+        </w:rPr>
+        <w:t xml:space="preserve">## 2  49990.00  77 175.00 124.97 125.00  15.33 0.12  20.00    -0.04     0.03</w:t>
+      </w:r>
+      <w:r>
+        <w:br/>
+      </w:r>
+      <w:r>
+        <w:rPr>
+          <w:rStyle w:val="VerbatimChar"/>
+        </w:rPr>
+        <w:t xml:space="preserve">## 3  27463.00  21 120.00  68.66  69.00  27.99 0.41  48.25     0.05    -1.09</w:t>
+      </w:r>
+      <w:r>
+        <w:br/>
+      </w:r>
+      <w:r>
+        <w:rPr>
+          <w:rStyle w:val="VerbatimChar"/>
+        </w:rPr>
+        <w:t xml:space="preserve">## 5 105936.00  10 509.00 264.84 272.00 147.38 0.56 259.50    -0.05    -1.20</w:t>
+      </w:r>
+      <w:r>
+        <w:br/>
+      </w:r>
+      <w:r>
+        <w:rPr>
+          <w:rStyle w:val="VerbatimChar"/>
+        </w:rPr>
+        <w:t xml:space="preserve">## 6  46318.00  24 191.00 115.80 117.00  23.68 0.20  31.00    -0.12     0.43</w:t>
+      </w:r>
+      <w:r>
+        <w:br/>
+      </w:r>
+      <w:r>
+        <w:rPr>
+          <w:rStyle w:val="VerbatimChar"/>
+        </w:rPr>
+        <w:t xml:space="preserve">## 1   2998.53   0  16.27   7.50   7.49   2.82 0.38   3.93     0.18    -0.10</w:t>
       </w:r>
     </w:p>
     <w:p>
@@ -534,34 +1302,234 @@
         <w:rPr>
           <w:rStyle w:val="CommentTok"/>
         </w:rPr>
-        <w:t xml:space="preserve">#if(!ISLR %in% installed.packages()) install.packages("ISLR")</w:t>
-      </w:r>
-      <w:r>
-        <w:br/>
-      </w:r>
+        <w:t xml:space="preserve">#Saída- Resumo das variáveis numéricas dos dados Carseats</w:t>
+      </w:r>
+    </w:p>
+    <w:p>
+      <w:pPr>
+        <w:pStyle w:val="FirstParagraph"/>
+      </w:pPr>
+      <w:r>
+        <w:t xml:space="preserve">Vamos agora verificar o resumo das variáveis categóricas, ou seja, ShelveLoc, Urban e US.</w:t>
+      </w:r>
+    </w:p>
+    <w:p>
+      <w:pPr>
+        <w:pStyle w:val="SourceCode"/>
+      </w:pPr>
       <w:r>
         <w:rPr>
           <w:rStyle w:val="FunctionTok"/>
         </w:rPr>
-        <w:t xml:space="preserve">library</w:t>
+        <w:t xml:space="preserve">ExpCTable</w:t>
       </w:r>
       <w:r>
         <w:rPr>
           <w:rStyle w:val="NormalTok"/>
         </w:rPr>
-        <w:t xml:space="preserve">(</w:t>
-      </w:r>
-      <w:r>
-        <w:rPr>
-          <w:rStyle w:val="StringTok"/>
-        </w:rPr>
-        <w:t xml:space="preserve">"ISLR"</w:t>
-      </w:r>
-      <w:r>
-        <w:rPr>
-          <w:rStyle w:val="NormalTok"/>
-        </w:rPr>
-        <w:t xml:space="preserve">)</w:t>
+        <w:t xml:space="preserve">(Carseats)</w:t>
+      </w:r>
+    </w:p>
+    <w:p>
+      <w:pPr>
+        <w:pStyle w:val="SourceCode"/>
+      </w:pPr>
+      <w:r>
+        <w:rPr>
+          <w:rStyle w:val="VerbatimChar"/>
+        </w:rPr>
+        <w:t xml:space="preserve">##     Variable  Valid Frequency Percent CumPercent</w:t>
+      </w:r>
+      <w:r>
+        <w:br/>
+      </w:r>
+      <w:r>
+        <w:rPr>
+          <w:rStyle w:val="VerbatimChar"/>
+        </w:rPr>
+        <w:t xml:space="preserve">## 1  ShelveLoc    Bad        96   24.00      24.00</w:t>
+      </w:r>
+      <w:r>
+        <w:br/>
+      </w:r>
+      <w:r>
+        <w:rPr>
+          <w:rStyle w:val="VerbatimChar"/>
+        </w:rPr>
+        <w:t xml:space="preserve">## 2  ShelveLoc   Good        85   21.25      45.25</w:t>
+      </w:r>
+      <w:r>
+        <w:br/>
+      </w:r>
+      <w:r>
+        <w:rPr>
+          <w:rStyle w:val="VerbatimChar"/>
+        </w:rPr>
+        <w:t xml:space="preserve">## 3  ShelveLoc Medium       219   54.75     100.00</w:t>
+      </w:r>
+      <w:r>
+        <w:br/>
+      </w:r>
+      <w:r>
+        <w:rPr>
+          <w:rStyle w:val="VerbatimChar"/>
+        </w:rPr>
+        <w:t xml:space="preserve">## 4  ShelveLoc  TOTAL       400      NA         NA</w:t>
+      </w:r>
+      <w:r>
+        <w:br/>
+      </w:r>
+      <w:r>
+        <w:rPr>
+          <w:rStyle w:val="VerbatimChar"/>
+        </w:rPr>
+        <w:t xml:space="preserve">## 5      Urban     No       118   29.50      29.50</w:t>
+      </w:r>
+      <w:r>
+        <w:br/>
+      </w:r>
+      <w:r>
+        <w:rPr>
+          <w:rStyle w:val="VerbatimChar"/>
+        </w:rPr>
+        <w:t xml:space="preserve">## 6      Urban    Yes       282   70.50     100.00</w:t>
+      </w:r>
+      <w:r>
+        <w:br/>
+      </w:r>
+      <w:r>
+        <w:rPr>
+          <w:rStyle w:val="VerbatimChar"/>
+        </w:rPr>
+        <w:t xml:space="preserve">## 7      Urban  TOTAL       400      NA         NA</w:t>
+      </w:r>
+      <w:r>
+        <w:br/>
+      </w:r>
+      <w:r>
+        <w:rPr>
+          <w:rStyle w:val="VerbatimChar"/>
+        </w:rPr>
+        <w:t xml:space="preserve">## 8         US     No       142   35.50      35.50</w:t>
+      </w:r>
+      <w:r>
+        <w:br/>
+      </w:r>
+      <w:r>
+        <w:rPr>
+          <w:rStyle w:val="VerbatimChar"/>
+        </w:rPr>
+        <w:t xml:space="preserve">## 9         US    Yes       258   64.50     100.00</w:t>
+      </w:r>
+      <w:r>
+        <w:br/>
+      </w:r>
+      <w:r>
+        <w:rPr>
+          <w:rStyle w:val="VerbatimChar"/>
+        </w:rPr>
+        <w:t xml:space="preserve">## 10        US  TOTAL       400      NA         NA</w:t>
+      </w:r>
+      <w:r>
+        <w:br/>
+      </w:r>
+      <w:r>
+        <w:rPr>
+          <w:rStyle w:val="VerbatimChar"/>
+        </w:rPr>
+        <w:t xml:space="preserve">## 11 Education     10        48   12.00      12.00</w:t>
+      </w:r>
+      <w:r>
+        <w:br/>
+      </w:r>
+      <w:r>
+        <w:rPr>
+          <w:rStyle w:val="VerbatimChar"/>
+        </w:rPr>
+        <w:t xml:space="preserve">## 12 Education     11        48   12.00      24.00</w:t>
+      </w:r>
+      <w:r>
+        <w:br/>
+      </w:r>
+      <w:r>
+        <w:rPr>
+          <w:rStyle w:val="VerbatimChar"/>
+        </w:rPr>
+        <w:t xml:space="preserve">## 13 Education     12        49   12.25      36.25</w:t>
+      </w:r>
+      <w:r>
+        <w:br/>
+      </w:r>
+      <w:r>
+        <w:rPr>
+          <w:rStyle w:val="VerbatimChar"/>
+        </w:rPr>
+        <w:t xml:space="preserve">## 14 Education     13        43   10.75      47.00</w:t>
+      </w:r>
+      <w:r>
+        <w:br/>
+      </w:r>
+      <w:r>
+        <w:rPr>
+          <w:rStyle w:val="VerbatimChar"/>
+        </w:rPr>
+        <w:t xml:space="preserve">## 15 Education     14        40   10.00      57.00</w:t>
+      </w:r>
+      <w:r>
+        <w:br/>
+      </w:r>
+      <w:r>
+        <w:rPr>
+          <w:rStyle w:val="VerbatimChar"/>
+        </w:rPr>
+        <w:t xml:space="preserve">## 16 Education     15        36    9.00      66.00</w:t>
+      </w:r>
+      <w:r>
+        <w:br/>
+      </w:r>
+      <w:r>
+        <w:rPr>
+          <w:rStyle w:val="VerbatimChar"/>
+        </w:rPr>
+        <w:t xml:space="preserve">## 17 Education     16        47   11.75      77.75</w:t>
+      </w:r>
+      <w:r>
+        <w:br/>
+      </w:r>
+      <w:r>
+        <w:rPr>
+          <w:rStyle w:val="VerbatimChar"/>
+        </w:rPr>
+        <w:t xml:space="preserve">## 18 Education     17        49   12.25      90.00</w:t>
+      </w:r>
+      <w:r>
+        <w:br/>
+      </w:r>
+      <w:r>
+        <w:rPr>
+          <w:rStyle w:val="VerbatimChar"/>
+        </w:rPr>
+        <w:t xml:space="preserve">## 19 Education     18        40   10.00     100.00</w:t>
+      </w:r>
+      <w:r>
+        <w:br/>
+      </w:r>
+      <w:r>
+        <w:rPr>
+          <w:rStyle w:val="VerbatimChar"/>
+        </w:rPr>
+        <w:t xml:space="preserve">## 20 Education  TOTAL       400      NA         NA</w:t>
+      </w:r>
+    </w:p>
+    <w:p>
+      <w:pPr>
+        <w:pStyle w:val="SourceCode"/>
+      </w:pPr>
+      <w:r>
+        <w:rPr>
+          <w:rStyle w:val="CommentTok"/>
+        </w:rPr>
+        <w:t xml:space="preserve">#Output- Resumo das variáveis categóricas dos dados Carseats</w:t>
       </w:r>
     </w:p>
     <w:p>
@@ -569,226 +1537,46 @@
         <w:pStyle w:val="FirstParagraph"/>
       </w:pPr>
       <w:r>
-        <w:t xml:space="preserve">Agora usaremos o SmartEDA para compreender: as dimensões do conjunto de dados, os nomes e tipos de dados de cada variável e observar um resumo geral de dados ausentes (missing data) .</w:t>
-      </w:r>
-    </w:p>
-    <w:p>
-      <w:pPr>
-        <w:pStyle w:val="SourceCode"/>
-      </w:pPr>
-      <w:r>
-        <w:rPr>
-          <w:rStyle w:val="NormalTok"/>
-        </w:rPr>
-        <w:t xml:space="preserve">Carseats </w:t>
-      </w:r>
-      <w:r>
-        <w:rPr>
-          <w:rStyle w:val="OtherTok"/>
-        </w:rPr>
-        <w:t xml:space="preserve">&lt;-</w:t>
-      </w:r>
-      <w:r>
-        <w:rPr>
-          <w:rStyle w:val="NormalTok"/>
-        </w:rPr>
-        <w:t xml:space="preserve"> ISLR</w:t>
-      </w:r>
-      <w:r>
-        <w:rPr>
-          <w:rStyle w:val="SpecialCharTok"/>
-        </w:rPr>
-        <w:t xml:space="preserve">::</w:t>
-      </w:r>
-      <w:r>
-        <w:rPr>
-          <w:rStyle w:val="NormalTok"/>
-        </w:rPr>
+        <w:t xml:space="preserve">Podemos visualizar as diferentes representações gráficas usando o pacote SmartEDA quando aplicado no conjunto de dados</w:t>
+      </w:r>
+      <w:r>
+        <w:t xml:space="preserve"> </w:t>
+      </w:r>
+      <w:r>
+        <w:t xml:space="preserve">“</w:t>
+      </w:r>
+      <w:r>
         <w:t xml:space="preserve">Carseats</w:t>
       </w:r>
       <w:r>
-        <w:br/>
-      </w:r>
-      <w:r>
-        <w:rPr>
-          <w:rStyle w:val="FunctionTok"/>
-        </w:rPr>
-        <w:t xml:space="preserve">ExpData</w:t>
-      </w:r>
-      <w:r>
-        <w:rPr>
-          <w:rStyle w:val="NormalTok"/>
-        </w:rPr>
-        <w:t xml:space="preserve">(</w:t>
-      </w:r>
-      <w:r>
-        <w:rPr>
-          <w:rStyle w:val="AttributeTok"/>
-        </w:rPr>
-        <w:t xml:space="preserve">data=</w:t>
-      </w:r>
-      <w:r>
-        <w:rPr>
-          <w:rStyle w:val="NormalTok"/>
-        </w:rPr>
-        <w:t xml:space="preserve">Carseats,</w:t>
-      </w:r>
-      <w:r>
-        <w:rPr>
-          <w:rStyle w:val="AttributeTok"/>
-        </w:rPr>
-        <w:t xml:space="preserve">type=</w:t>
-      </w:r>
-      <w:r>
-        <w:rPr>
-          <w:rStyle w:val="DecValTok"/>
-        </w:rPr>
-        <w:t xml:space="preserve">1</w:t>
-      </w:r>
-      <w:r>
-        <w:rPr>
-          <w:rStyle w:val="NormalTok"/>
-        </w:rPr>
-        <w:t xml:space="preserve">)</w:t>
-      </w:r>
-    </w:p>
-    <w:p>
-      <w:pPr>
-        <w:pStyle w:val="SourceCode"/>
-      </w:pPr>
-      <w:r>
-        <w:rPr>
-          <w:rStyle w:val="VerbatimChar"/>
-        </w:rPr>
-        <w:t xml:space="preserve">##                                           Descriptions     Value</w:t>
-      </w:r>
-      <w:r>
-        <w:br/>
-      </w:r>
-      <w:r>
-        <w:rPr>
-          <w:rStyle w:val="VerbatimChar"/>
-        </w:rPr>
-        <w:t xml:space="preserve">## 1                                   Sample size (nrow)       400</w:t>
-      </w:r>
-      <w:r>
-        <w:br/>
-      </w:r>
-      <w:r>
-        <w:rPr>
-          <w:rStyle w:val="VerbatimChar"/>
-        </w:rPr>
-        <w:t xml:space="preserve">## 2                              No. of variables (ncol)        11</w:t>
-      </w:r>
-      <w:r>
-        <w:br/>
-      </w:r>
-      <w:r>
-        <w:rPr>
-          <w:rStyle w:val="VerbatimChar"/>
-        </w:rPr>
-        <w:t xml:space="preserve">## 3                    No. of numeric/interger variables         8</w:t>
-      </w:r>
-      <w:r>
-        <w:br/>
-      </w:r>
-      <w:r>
-        <w:rPr>
-          <w:rStyle w:val="VerbatimChar"/>
-        </w:rPr>
-        <w:t xml:space="preserve">## 4                              No. of factor variables         3</w:t>
-      </w:r>
-      <w:r>
-        <w:br/>
-      </w:r>
-      <w:r>
-        <w:rPr>
-          <w:rStyle w:val="VerbatimChar"/>
-        </w:rPr>
-        <w:t xml:space="preserve">## 5                                No. of text variables         0</w:t>
-      </w:r>
-      <w:r>
-        <w:br/>
-      </w:r>
-      <w:r>
-        <w:rPr>
-          <w:rStyle w:val="VerbatimChar"/>
-        </w:rPr>
-        <w:t xml:space="preserve">## 6                             No. of logical variables         0</w:t>
-      </w:r>
-      <w:r>
-        <w:br/>
-      </w:r>
-      <w:r>
-        <w:rPr>
-          <w:rStyle w:val="VerbatimChar"/>
-        </w:rPr>
-        <w:t xml:space="preserve">## 7                          No. of identifier variables         0</w:t>
-      </w:r>
-      <w:r>
-        <w:br/>
-      </w:r>
-      <w:r>
-        <w:rPr>
-          <w:rStyle w:val="VerbatimChar"/>
-        </w:rPr>
-        <w:t xml:space="preserve">## 8                                No. of date variables         0</w:t>
-      </w:r>
-      <w:r>
-        <w:br/>
-      </w:r>
-      <w:r>
-        <w:rPr>
-          <w:rStyle w:val="VerbatimChar"/>
-        </w:rPr>
-        <w:t xml:space="preserve">## 9             No. of zero variance variables (uniform)         0</w:t>
-      </w:r>
-      <w:r>
-        <w:br/>
-      </w:r>
-      <w:r>
-        <w:rPr>
-          <w:rStyle w:val="VerbatimChar"/>
-        </w:rPr>
-        <w:t xml:space="preserve">## 10               %. of variables having complete cases 100% (11)</w:t>
-      </w:r>
-      <w:r>
-        <w:br/>
-      </w:r>
-      <w:r>
-        <w:rPr>
-          <w:rStyle w:val="VerbatimChar"/>
-        </w:rPr>
-        <w:t xml:space="preserve">## 11   %. of variables having &gt;0% and &lt;50% missing cases    0% (0)</w:t>
-      </w:r>
-      <w:r>
-        <w:br/>
-      </w:r>
-      <w:r>
-        <w:rPr>
-          <w:rStyle w:val="VerbatimChar"/>
-        </w:rPr>
-        <w:t xml:space="preserve">## 12 %. of variables having &gt;=50% and &lt;90% missing cases    0% (0)</w:t>
-      </w:r>
-      <w:r>
-        <w:br/>
-      </w:r>
-      <w:r>
-        <w:rPr>
-          <w:rStyle w:val="VerbatimChar"/>
-        </w:rPr>
-        <w:t xml:space="preserve">## 13          %. of variables having &gt;=90% missing cases    0% (0)</w:t>
-      </w:r>
-    </w:p>
-    <w:p>
-      <w:pPr>
-        <w:pStyle w:val="SourceCode"/>
-      </w:pPr>
-      <w:r>
-        <w:rPr>
-          <w:rStyle w:val="CommentTok"/>
-        </w:rPr>
-        <w:t xml:space="preserve"># saída</w:t>
+        <w:t xml:space="preserve">”</w:t>
+      </w:r>
+      <w:r>
+        <w:t xml:space="preserve">.</w:t>
+      </w:r>
+      <w:r>
+        <w:br/>
+      </w:r>
+      <w:r>
+        <w:t xml:space="preserve">A Figura 2 mostra as diferentes visualizações gráficas, ou seja, gráfico de dispersão, gráfico de densidade, gráfico de barras, gráfico de caixa, gráfico de normalidade e gráfico de coordenadas.</w:t>
+      </w:r>
+    </w:p>
+    <w:p>
+      <w:pPr>
+        <w:pStyle w:val="BodyText"/>
+      </w:pPr>
+      <w:r>
+        <w:t xml:space="preserve">Figura 2: Representações gráficas dos dados Carseats usando SmartEDA</w:t>
+      </w:r>
+    </w:p>
+    <w:bookmarkEnd w:id="25"/>
+    <w:bookmarkStart w:id="29" w:name="comparação-com-outros-pacotes-r"/>
+    <w:p>
+      <w:pPr>
+        <w:pStyle w:val="Heading3"/>
+      </w:pPr>
+      <w:r>
+        <w:t xml:space="preserve">Comparação com outros pacotes R</w:t>
       </w:r>
     </w:p>
     <w:p>
@@ -796,307 +1584,145 @@
         <w:pStyle w:val="FirstParagraph"/>
       </w:pPr>
       <w:r>
-        <w:t xml:space="preserve">Agora, vejamos o resumo das variáveis numéricas/inteiras, como Advertising, Age,CompPrice, Income, Population, Price e Sales.</w:t>
-      </w:r>
-    </w:p>
-    <w:p>
-      <w:pPr>
-        <w:pStyle w:val="SourceCode"/>
-      </w:pPr>
-      <w:r>
-        <w:rPr>
-          <w:rStyle w:val="FunctionTok"/>
-        </w:rPr>
-        <w:t xml:space="preserve">ExpNumStat</w:t>
-      </w:r>
-      <w:r>
-        <w:rPr>
-          <w:rStyle w:val="NormalTok"/>
-        </w:rPr>
-        <w:t xml:space="preserve">(Carseats,</w:t>
-      </w:r>
-      <w:r>
-        <w:rPr>
-          <w:rStyle w:val="AttributeTok"/>
-        </w:rPr>
-        <w:t xml:space="preserve">by=</w:t>
-      </w:r>
-      <w:r>
-        <w:rPr>
-          <w:rStyle w:val="StringTok"/>
-        </w:rPr>
-        <w:t xml:space="preserve">"A"</w:t>
-      </w:r>
-      <w:r>
-        <w:rPr>
-          <w:rStyle w:val="NormalTok"/>
-        </w:rPr>
-        <w:t xml:space="preserve">,</w:t>
-      </w:r>
-      <w:r>
-        <w:rPr>
-          <w:rStyle w:val="AttributeTok"/>
-        </w:rPr>
-        <w:t xml:space="preserve">gp=</w:t>
-      </w:r>
-      <w:r>
-        <w:rPr>
-          <w:rStyle w:val="ConstantTok"/>
-        </w:rPr>
-        <w:t xml:space="preserve">NULL</w:t>
-      </w:r>
-      <w:r>
-        <w:rPr>
-          <w:rStyle w:val="NormalTok"/>
-        </w:rPr>
-        <w:t xml:space="preserve">,</w:t>
-      </w:r>
-      <w:r>
-        <w:rPr>
-          <w:rStyle w:val="AttributeTok"/>
-        </w:rPr>
-        <w:t xml:space="preserve">Qnt=</w:t>
-      </w:r>
-      <w:r>
-        <w:rPr>
-          <w:rStyle w:val="ConstantTok"/>
-        </w:rPr>
-        <w:t xml:space="preserve">NULL</w:t>
-      </w:r>
-      <w:r>
-        <w:rPr>
-          <w:rStyle w:val="NormalTok"/>
-        </w:rPr>
-        <w:t xml:space="preserve">,</w:t>
-      </w:r>
-      <w:r>
-        <w:rPr>
-          <w:rStyle w:val="AttributeTok"/>
-        </w:rPr>
-        <w:t xml:space="preserve">MesofShape=</w:t>
-      </w:r>
-      <w:r>
-        <w:rPr>
-          <w:rStyle w:val="DecValTok"/>
-        </w:rPr>
-        <w:t xml:space="preserve">2</w:t>
-      </w:r>
-      <w:r>
-        <w:rPr>
-          <w:rStyle w:val="NormalTok"/>
-        </w:rPr>
-        <w:t xml:space="preserve">, </w:t>
-      </w:r>
-      <w:r>
-        <w:rPr>
-          <w:rStyle w:val="AttributeTok"/>
-        </w:rPr>
-        <w:t xml:space="preserve">Outlier=</w:t>
-      </w:r>
-      <w:r>
-        <w:rPr>
-          <w:rStyle w:val="ConstantTok"/>
-        </w:rPr>
-        <w:t xml:space="preserve">FALSE</w:t>
-      </w:r>
-      <w:r>
-        <w:rPr>
-          <w:rStyle w:val="NormalTok"/>
-        </w:rPr>
-        <w:t xml:space="preserve">,</w:t>
-      </w:r>
-      <w:r>
-        <w:rPr>
-          <w:rStyle w:val="AttributeTok"/>
-        </w:rPr>
-        <w:t xml:space="preserve">round=</w:t>
-      </w:r>
-      <w:r>
-        <w:rPr>
-          <w:rStyle w:val="DecValTok"/>
-        </w:rPr>
-        <w:t xml:space="preserve">2</w:t>
-      </w:r>
-      <w:r>
-        <w:rPr>
-          <w:rStyle w:val="NormalTok"/>
-        </w:rPr>
-        <w:t xml:space="preserve">,</w:t>
-      </w:r>
-      <w:r>
-        <w:rPr>
-          <w:rStyle w:val="AttributeTok"/>
-        </w:rPr>
-        <w:t xml:space="preserve">Nlim=</w:t>
-      </w:r>
-      <w:r>
-        <w:rPr>
-          <w:rStyle w:val="DecValTok"/>
-        </w:rPr>
-        <w:t xml:space="preserve">10</w:t>
-      </w:r>
-      <w:r>
-        <w:rPr>
-          <w:rStyle w:val="NormalTok"/>
-        </w:rPr>
-        <w:t xml:space="preserve">)</w:t>
-      </w:r>
-    </w:p>
-    <w:p>
-      <w:pPr>
-        <w:pStyle w:val="SourceCode"/>
-      </w:pPr>
-      <w:r>
-        <w:rPr>
-          <w:rStyle w:val="VerbatimChar"/>
-        </w:rPr>
-        <w:t xml:space="preserve">##         Vname Group  TN nNeg nZero nPos NegInf PosInf NA_Value Per_of_Missing</w:t>
-      </w:r>
-      <w:r>
-        <w:br/>
-      </w:r>
-      <w:r>
-        <w:rPr>
-          <w:rStyle w:val="VerbatimChar"/>
-        </w:rPr>
-        <w:t xml:space="preserve">## 4 Advertising   All 400    0   144  256      0      0        0              0</w:t>
-      </w:r>
-      <w:r>
-        <w:br/>
-      </w:r>
-      <w:r>
-        <w:rPr>
-          <w:rStyle w:val="VerbatimChar"/>
-        </w:rPr>
-        <w:t xml:space="preserve">## 7         Age   All 400    0     0  400      0      0        0              0</w:t>
-      </w:r>
-      <w:r>
-        <w:br/>
-      </w:r>
-      <w:r>
-        <w:rPr>
-          <w:rStyle w:val="VerbatimChar"/>
-        </w:rPr>
-        <w:t xml:space="preserve">## 2   CompPrice   All 400    0     0  400      0      0        0              0</w:t>
-      </w:r>
-      <w:r>
-        <w:br/>
-      </w:r>
-      <w:r>
-        <w:rPr>
-          <w:rStyle w:val="VerbatimChar"/>
-        </w:rPr>
-        <w:t xml:space="preserve">## 3      Income   All 400    0     0  400      0      0        0              0</w:t>
-      </w:r>
-      <w:r>
-        <w:br/>
-      </w:r>
-      <w:r>
-        <w:rPr>
-          <w:rStyle w:val="VerbatimChar"/>
-        </w:rPr>
-        <w:t xml:space="preserve">## 5  Population   All 400    0     0  400      0      0        0              0</w:t>
-      </w:r>
-      <w:r>
-        <w:br/>
-      </w:r>
-      <w:r>
-        <w:rPr>
-          <w:rStyle w:val="VerbatimChar"/>
-        </w:rPr>
-        <w:t xml:space="preserve">## 6       Price   All 400    0     0  400      0      0        0              0</w:t>
-      </w:r>
-      <w:r>
-        <w:br/>
-      </w:r>
-      <w:r>
-        <w:rPr>
-          <w:rStyle w:val="VerbatimChar"/>
-        </w:rPr>
-        <w:t xml:space="preserve">## 1       Sales   All 400    0     1  399      0      0        0              0</w:t>
-      </w:r>
-      <w:r>
-        <w:br/>
-      </w:r>
-      <w:r>
-        <w:rPr>
-          <w:rStyle w:val="VerbatimChar"/>
-        </w:rPr>
-        <w:t xml:space="preserve">##         sum min    max   mean median     SD   CV    IQR Skewness Kurtosis</w:t>
-      </w:r>
-      <w:r>
-        <w:br/>
-      </w:r>
-      <w:r>
-        <w:rPr>
-          <w:rStyle w:val="VerbatimChar"/>
-        </w:rPr>
-        <w:t xml:space="preserve">## 4   2654.00   0  29.00   6.64   5.00   6.65 1.00  12.00     0.64    -0.55</w:t>
-      </w:r>
-      <w:r>
-        <w:br/>
-      </w:r>
-      <w:r>
-        <w:rPr>
-          <w:rStyle w:val="VerbatimChar"/>
-        </w:rPr>
-        <w:t xml:space="preserve">## 7  21329.00  25  80.00  53.32  54.50  16.20 0.30  26.25    -0.08    -1.14</w:t>
-      </w:r>
-      <w:r>
-        <w:br/>
-      </w:r>
-      <w:r>
-        <w:rPr>
-          <w:rStyle w:val="VerbatimChar"/>
-        </w:rPr>
-        <w:t xml:space="preserve">## 2  49990.00  77 175.00 124.97 125.00  15.33 0.12  20.00    -0.04     0.03</w:t>
-      </w:r>
-      <w:r>
-        <w:br/>
-      </w:r>
-      <w:r>
-        <w:rPr>
-          <w:rStyle w:val="VerbatimChar"/>
-        </w:rPr>
-        <w:t xml:space="preserve">## 3  27463.00  21 120.00  68.66  69.00  27.99 0.41  48.25     0.05    -1.09</w:t>
-      </w:r>
-      <w:r>
-        <w:br/>
-      </w:r>
-      <w:r>
-        <w:rPr>
-          <w:rStyle w:val="VerbatimChar"/>
-        </w:rPr>
-        <w:t xml:space="preserve">## 5 105936.00  10 509.00 264.84 272.00 147.38 0.56 259.50    -0.05    -1.20</w:t>
-      </w:r>
-      <w:r>
-        <w:br/>
-      </w:r>
-      <w:r>
-        <w:rPr>
-          <w:rStyle w:val="VerbatimChar"/>
-        </w:rPr>
-        <w:t xml:space="preserve">## 6  46318.00  24 191.00 115.80 117.00  23.68 0.20  31.00    -0.12     0.43</w:t>
-      </w:r>
-      <w:r>
-        <w:br/>
-      </w:r>
-      <w:r>
-        <w:rPr>
-          <w:rStyle w:val="VerbatimChar"/>
-        </w:rPr>
-        <w:t xml:space="preserve">## 1   2998.53   0  16.27   7.50   7.49   2.82 0.38   3.93     0.18    -0.10</w:t>
-      </w:r>
-    </w:p>
-    <w:p>
-      <w:pPr>
-        <w:pStyle w:val="SourceCode"/>
-      </w:pPr>
-      <w:r>
-        <w:rPr>
-          <w:rStyle w:val="CommentTok"/>
-        </w:rPr>
-        <w:t xml:space="preserve">#Saída- Resumo das variáveis numéricas dos dados Carseats</w:t>
+        <w:t xml:space="preserve">A Figura 3 compara o pacote SmartEDA (Ubrangala, Rama, Kondapalli, &amp; Putatunda, 2018) com outros pacotes semelhantes disponíveis no CRAN para análise exploratória de dados viz. dlookr (Ryu, 2018), DataExplorer (Cui, 2018), Hmisc (Harrell et al., 2018), exploreR (Coates, 2016), Tutor (Nair, 2018) e summarytools (Comtois, 2018).</w:t>
+      </w:r>
+      <w:r>
+        <w:br/>
+      </w:r>
+      <w:r>
+        <w:t xml:space="preserve">A métrica para avaliação é a disponibilidade de vários recursos desejados para realizar uma análise exploratória de dados, tais como:</w:t>
+      </w:r>
+      <w:r>
+        <w:br/>
+      </w:r>
+      <w:r>
+        <w:t xml:space="preserve">(a) Descrever informações básicas para dados de entrada;</w:t>
+      </w:r>
+      <w:r>
+        <w:br/>
+      </w:r>
+      <w:r>
+        <w:t xml:space="preserve">(b) Função a fornecer;</w:t>
+      </w:r>
+      <w:r>
+        <w:br/>
+      </w:r>
+      <w:r>
+        <w:t xml:space="preserve">(c) estatísticas resumidas para todas as variáveis numéricas;</w:t>
+      </w:r>
+      <w:r>
+        <w:br/>
+      </w:r>
+      <w:r>
+        <w:t xml:space="preserve">(d) Função para fornecer gráficos para todas as variáveis numéricas;</w:t>
+      </w:r>
+      <w:r>
+        <w:br/>
+      </w:r>
+      <w:r>
+        <w:t xml:space="preserve">(e) Função para fornecer estatísticas de resumo para todos os caracteres ou variáveis categóricas;</w:t>
+      </w:r>
+      <w:r>
+        <w:br/>
+      </w:r>
+      <w:r>
+        <w:t xml:space="preserve">(f) Função para fornecer gráficos para todos os caracteres ou variáveis categóricas;</w:t>
+      </w:r>
+      <w:r>
+        <w:br/>
+      </w:r>
+      <w:r>
+        <w:t xml:space="preserve">(g) Estatísticas de resumo personalizadas - extensão para dados. Pacote data.table;</w:t>
+      </w:r>
+      <w:r>
+        <w:br/>
+      </w:r>
+      <w:r>
+        <w:t xml:space="preserve">(h) Gráficos de normalidade/coordenadas;</w:t>
+      </w:r>
+      <w:r>
+        <w:br/>
+      </w:r>
+      <w:r>
+        <w:t xml:space="preserve">(i) Binarização/binning de recursos;</w:t>
+      </w:r>
+      <w:r>
+        <w:br/>
+      </w:r>
+      <w:r>
+        <w:t xml:space="preserve">(j) Padronizar/faltar imputação/diagnosticar outliers; e</w:t>
+      </w:r>
+      <w:r>
+        <w:br/>
+      </w:r>
+      <w:r>
+        <w:t xml:space="preserve">(k) Relatório HTML usando rmarkdown/Shiny.</w:t>
+      </w:r>
+    </w:p>
+    <w:p>
+      <w:pPr>
+        <w:pStyle w:val="BodyText"/>
+      </w:pPr>
+      <w:r>
+        <w:t xml:space="preserve">#</w:t>
+      </w:r>
+      <w:r>
+        <w:t xml:space="preserve">Figura 3: Tabela comparativa de pacotes EDA.</w:t>
+      </w:r>
+      <w:r>
+        <w:t xml:space="preserve"> </w:t>
+      </w:r>
+      <w:r>
+        <w:drawing>
+          <wp:inline>
+            <wp:extent cx="5334000" cy="2238621"/>
+            <wp:effectExtent b="0" l="0" r="0" t="0"/>
+            <wp:docPr descr="Figura 3: Tabela comparativa de pacotes EDA." title="" id="27" name="Picture"/>
+            <a:graphic>
+              <a:graphicData uri="http://schemas.openxmlformats.org/drawingml/2006/picture">
+                <pic:pic>
+                  <pic:nvPicPr>
+                    <pic:cNvPr descr="/Users/jpalbino/Library/Mobile%20Documents/com~apple~CloudDocs/GitHub/with-a-little-help-from-my-friends/figuras/EDA-Tabela-comparativa-pacotes.jpg" id="28" name="Picture"/>
+                    <pic:cNvPicPr>
+                      <a:picLocks noChangeArrowheads="1" noChangeAspect="1"/>
+                    </pic:cNvPicPr>
+                  </pic:nvPicPr>
+                  <pic:blipFill>
+                    <a:blip r:embed="rId26"/>
+                    <a:stretch>
+                      <a:fillRect/>
+                    </a:stretch>
+                  </pic:blipFill>
+                  <pic:spPr bwMode="auto">
+                    <a:xfrm>
+                      <a:off x="0" y="0"/>
+                      <a:ext cx="5334000" cy="2238621"/>
+                    </a:xfrm>
+                    <a:prstGeom prst="rect">
+                      <a:avLst/>
+                    </a:prstGeom>
+                    <a:noFill/>
+                    <a:ln w="9525">
+                      <a:noFill/>
+                      <a:headEnd/>
+                      <a:tailEnd/>
+                    </a:ln>
+                  </pic:spPr>
+                </pic:pic>
+              </a:graphicData>
+            </a:graphic>
+          </wp:inline>
+        </w:drawing>
+      </w:r>
+    </w:p>
+    <w:bookmarkEnd w:id="29"/>
+    <w:bookmarkStart w:id="30" w:name="conclusão"/>
+    <w:p>
+      <w:pPr>
+        <w:pStyle w:val="Heading3"/>
+      </w:pPr>
+      <w:r>
+        <w:t xml:space="preserve">Conclusão</w:t>
       </w:r>
     </w:p>
     <w:p>
@@ -1104,226 +1730,71 @@
         <w:pStyle w:val="FirstParagraph"/>
       </w:pPr>
       <w:r>
-        <w:t xml:space="preserve">Vamos agora verificar o resumo das variáveis categóricas, ou seja, ShelveLoc, Urban e US.</w:t>
-      </w:r>
-    </w:p>
-    <w:p>
-      <w:pPr>
-        <w:pStyle w:val="SourceCode"/>
-      </w:pPr>
-      <w:r>
-        <w:rPr>
-          <w:rStyle w:val="FunctionTok"/>
-        </w:rPr>
-        <w:t xml:space="preserve">ExpCTable</w:t>
-      </w:r>
-      <w:r>
-        <w:rPr>
-          <w:rStyle w:val="NormalTok"/>
-        </w:rPr>
-        <w:t xml:space="preserve">(Carseats)</w:t>
-      </w:r>
-    </w:p>
-    <w:p>
-      <w:pPr>
-        <w:pStyle w:val="SourceCode"/>
-      </w:pPr>
-      <w:r>
-        <w:rPr>
-          <w:rStyle w:val="VerbatimChar"/>
-        </w:rPr>
-        <w:t xml:space="preserve">##     Variable  Valid Frequency Percent CumPercent</w:t>
-      </w:r>
-      <w:r>
-        <w:br/>
-      </w:r>
-      <w:r>
-        <w:rPr>
-          <w:rStyle w:val="VerbatimChar"/>
-        </w:rPr>
-        <w:t xml:space="preserve">## 1  ShelveLoc    Bad        96   24.00      24.00</w:t>
-      </w:r>
-      <w:r>
-        <w:br/>
-      </w:r>
-      <w:r>
-        <w:rPr>
-          <w:rStyle w:val="VerbatimChar"/>
-        </w:rPr>
-        <w:t xml:space="preserve">## 2  ShelveLoc   Good        85   21.25      45.25</w:t>
-      </w:r>
-      <w:r>
-        <w:br/>
-      </w:r>
-      <w:r>
-        <w:rPr>
-          <w:rStyle w:val="VerbatimChar"/>
-        </w:rPr>
-        <w:t xml:space="preserve">## 3  ShelveLoc Medium       219   54.75     100.00</w:t>
-      </w:r>
-      <w:r>
-        <w:br/>
-      </w:r>
-      <w:r>
-        <w:rPr>
-          <w:rStyle w:val="VerbatimChar"/>
-        </w:rPr>
-        <w:t xml:space="preserve">## 4  ShelveLoc  TOTAL       400      NA         NA</w:t>
-      </w:r>
-      <w:r>
-        <w:br/>
-      </w:r>
-      <w:r>
-        <w:rPr>
-          <w:rStyle w:val="VerbatimChar"/>
-        </w:rPr>
-        <w:t xml:space="preserve">## 5      Urban     No       118   29.50      29.50</w:t>
-      </w:r>
-      <w:r>
-        <w:br/>
-      </w:r>
-      <w:r>
-        <w:rPr>
-          <w:rStyle w:val="VerbatimChar"/>
-        </w:rPr>
-        <w:t xml:space="preserve">## 6      Urban    Yes       282   70.50     100.00</w:t>
-      </w:r>
-      <w:r>
-        <w:br/>
-      </w:r>
-      <w:r>
-        <w:rPr>
-          <w:rStyle w:val="VerbatimChar"/>
-        </w:rPr>
-        <w:t xml:space="preserve">## 7      Urban  TOTAL       400      NA         NA</w:t>
-      </w:r>
-      <w:r>
-        <w:br/>
-      </w:r>
-      <w:r>
-        <w:rPr>
-          <w:rStyle w:val="VerbatimChar"/>
-        </w:rPr>
-        <w:t xml:space="preserve">## 8         US     No       142   35.50      35.50</w:t>
-      </w:r>
-      <w:r>
-        <w:br/>
-      </w:r>
-      <w:r>
-        <w:rPr>
-          <w:rStyle w:val="VerbatimChar"/>
-        </w:rPr>
-        <w:t xml:space="preserve">## 9         US    Yes       258   64.50     100.00</w:t>
-      </w:r>
-      <w:r>
-        <w:br/>
-      </w:r>
-      <w:r>
-        <w:rPr>
-          <w:rStyle w:val="VerbatimChar"/>
-        </w:rPr>
-        <w:t xml:space="preserve">## 10        US  TOTAL       400      NA         NA</w:t>
-      </w:r>
-      <w:r>
-        <w:br/>
-      </w:r>
-      <w:r>
-        <w:rPr>
-          <w:rStyle w:val="VerbatimChar"/>
-        </w:rPr>
-        <w:t xml:space="preserve">## 11 Education     10        48   12.00      12.00</w:t>
-      </w:r>
-      <w:r>
-        <w:br/>
-      </w:r>
-      <w:r>
-        <w:rPr>
-          <w:rStyle w:val="VerbatimChar"/>
-        </w:rPr>
-        <w:t xml:space="preserve">## 12 Education     11        48   12.00      24.00</w:t>
-      </w:r>
-      <w:r>
-        <w:br/>
-      </w:r>
-      <w:r>
-        <w:rPr>
-          <w:rStyle w:val="VerbatimChar"/>
-        </w:rPr>
-        <w:t xml:space="preserve">## 13 Education     12        49   12.25      36.25</w:t>
-      </w:r>
-      <w:r>
-        <w:br/>
-      </w:r>
-      <w:r>
-        <w:rPr>
-          <w:rStyle w:val="VerbatimChar"/>
-        </w:rPr>
-        <w:t xml:space="preserve">## 14 Education     13        43   10.75      47.00</w:t>
-      </w:r>
-      <w:r>
-        <w:br/>
-      </w:r>
-      <w:r>
-        <w:rPr>
-          <w:rStyle w:val="VerbatimChar"/>
-        </w:rPr>
-        <w:t xml:space="preserve">## 15 Education     14        40   10.00      57.00</w:t>
-      </w:r>
-      <w:r>
-        <w:br/>
-      </w:r>
-      <w:r>
-        <w:rPr>
-          <w:rStyle w:val="VerbatimChar"/>
-        </w:rPr>
-        <w:t xml:space="preserve">## 16 Education     15        36    9.00      66.00</w:t>
-      </w:r>
-      <w:r>
-        <w:br/>
-      </w:r>
-      <w:r>
-        <w:rPr>
-          <w:rStyle w:val="VerbatimChar"/>
-        </w:rPr>
-        <w:t xml:space="preserve">## 17 Education     16        47   11.75      77.75</w:t>
-      </w:r>
-      <w:r>
-        <w:br/>
-      </w:r>
-      <w:r>
-        <w:rPr>
-          <w:rStyle w:val="VerbatimChar"/>
-        </w:rPr>
-        <w:t xml:space="preserve">## 18 Education     17        49   12.25      90.00</w:t>
-      </w:r>
-      <w:r>
-        <w:br/>
-      </w:r>
-      <w:r>
-        <w:rPr>
-          <w:rStyle w:val="VerbatimChar"/>
-        </w:rPr>
-        <w:t xml:space="preserve">## 19 Education     18        40   10.00     100.00</w:t>
-      </w:r>
-      <w:r>
-        <w:br/>
-      </w:r>
-      <w:r>
-        <w:rPr>
-          <w:rStyle w:val="VerbatimChar"/>
-        </w:rPr>
-        <w:t xml:space="preserve">## 20 Education  TOTAL       400      NA         NA</w:t>
-      </w:r>
-    </w:p>
-    <w:p>
-      <w:pPr>
-        <w:pStyle w:val="SourceCode"/>
-      </w:pPr>
-      <w:r>
-        <w:rPr>
-          <w:rStyle w:val="CommentTok"/>
-        </w:rPr>
-        <w:t xml:space="preserve">#Output- Resumo das variáveis categóricas dos dados Carseats</w:t>
+        <w:t xml:space="preserve">A contribuição deste trabalho está no desenvolvimento de um novo pacote em R ou seja, SmartEDA para Análise Exploratória de Dados automatizada.</w:t>
+      </w:r>
+      <w:r>
+        <w:br/>
+      </w:r>
+      <w:r>
+        <w:t xml:space="preserve">O pacote SmartEDA ajuda na implementação da Análise Exploratória de Dados completa apenas executando a função em vez de escrever um código R demorado. Os usuários do SmartEDA podem automatizar todo o processo de EDA em qualquer conjunto de dados com funções fáceis de implementar e exportar relatórios de EDA que seguem as melhores práticas da indústria e da academia.</w:t>
+      </w:r>
+      <w:r>
+        <w:br/>
+      </w:r>
+      <w:r>
+        <w:t xml:space="preserve">O SmartEDA pode fornecer estatísticas resumidas junto com gráficos para variáveis numéricas e categóricas. Ele também fornece uma extensão para o pacote data.table que nenhum dos outros pacotes disponíveis no CRAN oferece.</w:t>
+      </w:r>
+      <w:r>
+        <w:br/>
+      </w:r>
+      <w:r>
+        <w:t xml:space="preserve">No geral, os principais benefícios do SmartEDA estão na economia de tempo de desenvolvimento, menor porcentagem de erros e reprodutibilidade.</w:t>
+      </w:r>
+      <w:r>
+        <w:br/>
+      </w:r>
+      <w:r>
+        <w:t xml:space="preserve">Em setembro de 2019, o pacote SmartEDA tinha mais de 6.000 downloads, o que indica sua aceitabilidade e maturidade nas estatísticas e na comunidade de aprendizado de máquina.</w:t>
+      </w:r>
+      <w:r>
+        <w:br/>
+      </w:r>
+      <w:r>
+        <w:t xml:space="preserve">Podemos ver na Figura 3 que a versão atual do SmartEDA possui quase todas as características desejadas mencionadas acima, exceto os pontos (h) e (i), ou seja, gráficos de normalidade e binning de recursos, respectivamente. Esses dois recursos seriam incorporados na próxima versão e estamos trabalhando nisso.</w:t>
+      </w:r>
+      <w:r>
+        <w:br/>
+      </w:r>
+      <w:r>
+        <w:t xml:space="preserve">No entanto, a funcionalidade exclusiva e mais forte fornecida pelo SmartEDA é o ponto (f), ou seja, uma extensão para o pacote data.table que nenhum dos outros pacotes oferece. Assim, o SmartEDA agrega valor devido à importância e popularidade do data.table entre os usuários do R para analisar grandes conjuntos de dados.</w:t>
+      </w:r>
+      <w:r>
+        <w:br/>
+      </w:r>
+      <w:r>
+        <w:t xml:space="preserve">A Figura 3 mostra que o SmartEDA é melhor do que quase todos os outros pacotes disponíveis no CRAN.</w:t>
+      </w:r>
+      <w:r>
+        <w:br/>
+      </w:r>
+      <w:r>
+        <w:t xml:space="preserve">O concorrente mais próximo do SmartEDA parece ser o pacote DataExplorer, mas este não possui os recursos de dataviz (b) e (f). Função para fornecer estatísticas de resumo para todas as variáveis numéricas e extensão para dados e para o acote data.table, respectivamente.</w:t>
+      </w:r>
+      <w:r>
+        <w:br/>
+      </w:r>
+      <w:r>
+        <w:t xml:space="preserve">Além disso, outra característica distintiva que o SmartEDA possui, mas nenhum dos outros pacotes semelhantes possuem, é a capacidade de exportar todos os gráficos em um pdf.</w:t>
+      </w:r>
+    </w:p>
+    <w:bookmarkEnd w:id="30"/>
+    <w:bookmarkStart w:id="32" w:name="disponibilidade"/>
+    <w:p>
+      <w:pPr>
+        <w:pStyle w:val="Heading3"/>
+      </w:pPr>
+      <w:r>
+        <w:t xml:space="preserve">Disponibilidade</w:t>
       </w:r>
     </w:p>
     <w:p>
@@ -1331,235 +1802,12 @@
         <w:pStyle w:val="FirstParagraph"/>
       </w:pPr>
       <w:r>
-        <w:t xml:space="preserve">Podemos visualizar as diferentes representações gráficas usando o pacote SmartEDA quando aplicado no conjunto de dados</w:t>
-      </w:r>
-      <w:r>
-        <w:t xml:space="preserve"> </w:t>
-      </w:r>
-      <w:r>
-        <w:t xml:space="preserve">“</w:t>
-      </w:r>
-      <w:r>
-        <w:t xml:space="preserve">Carseats</w:t>
-      </w:r>
-      <w:r>
-        <w:t xml:space="preserve">”</w:t>
-      </w:r>
-      <w:r>
-        <w:t xml:space="preserve">.</w:t>
-      </w:r>
-      <w:r>
-        <w:br/>
-      </w:r>
-      <w:r>
-        <w:t xml:space="preserve">A Figura 2 mostra as diferentes visualizações gráficas, ou seja, gráfico de dispersão, gráfico de densidade, gráfico de barras, gráfico de caixa, gráfico de normalidade e gráfico de coordenadas.</w:t>
-      </w:r>
-    </w:p>
-    <w:p>
-      <w:pPr>
-        <w:pStyle w:val="BodyText"/>
-      </w:pPr>
-      <w:r>
-        <w:t xml:space="preserve">Figura 2: Representações gráficas dos dados Carseats usando SmartEDA</w:t>
-      </w:r>
-    </w:p>
-    <w:bookmarkEnd w:id="22"/>
-    <w:bookmarkStart w:id="23" w:name="comparação-com-outros-pacotes-r"/>
-    <w:p>
-      <w:pPr>
-        <w:pStyle w:val="Heading3"/>
-      </w:pPr>
-      <w:r>
-        <w:t xml:space="preserve">Comparação com outros pacotes R</w:t>
-      </w:r>
-    </w:p>
-    <w:p>
-      <w:pPr>
-        <w:pStyle w:val="FirstParagraph"/>
-      </w:pPr>
-      <w:r>
-        <w:t xml:space="preserve">A Figura 3 compara o pacote SmartEDA (Ubrangala, Rama, Kondapalli, &amp; Putatunda, 2018) com outros pacotes semelhantes disponíveis no CRAN para análise exploratória de dados viz. dlookr (Ryu, 2018), DataExplorer (Cui, 2018), Hmisc (Harrell et al., 2018), exploreR (Coates, 2016), Tutor (Nair, 2018) e summarytools (Comtois, 2018).</w:t>
-      </w:r>
-      <w:r>
-        <w:br/>
-      </w:r>
-      <w:r>
-        <w:t xml:space="preserve">A métrica para avaliação é a disponibilidade de vários recursos desejados para realizar uma análise exploratória de dados, tais como:</w:t>
-      </w:r>
-      <w:r>
-        <w:br/>
-      </w:r>
-      <w:r>
-        <w:t xml:space="preserve">(a) Descrever informações básicas para dados de entrada;</w:t>
-      </w:r>
-      <w:r>
-        <w:br/>
-      </w:r>
-      <w:r>
-        <w:t xml:space="preserve">(b) Função a fornecer;</w:t>
-      </w:r>
-      <w:r>
-        <w:br/>
-      </w:r>
-      <w:r>
-        <w:t xml:space="preserve">(c) estatísticas resumidas para todas as variáveis numéricas;</w:t>
-      </w:r>
-      <w:r>
-        <w:br/>
-      </w:r>
-      <w:r>
-        <w:t xml:space="preserve">(d) Função para fornecer gráficos para todas as variáveis numéricas;</w:t>
-      </w:r>
-      <w:r>
-        <w:br/>
-      </w:r>
-      <w:r>
-        <w:t xml:space="preserve">(e) Função para fornecer estatísticas de resumo para todos os caracteres ou variáveis categóricas;</w:t>
-      </w:r>
-      <w:r>
-        <w:br/>
-      </w:r>
-      <w:r>
-        <w:t xml:space="preserve">(f) Função para fornecer gráficos para todos os caracteres ou variáveis categóricas;</w:t>
-      </w:r>
-      <w:r>
-        <w:br/>
-      </w:r>
-      <w:r>
-        <w:t xml:space="preserve">(g) Estatísticas de resumo personalizadas - extensão para dados. Pacote data.table;</w:t>
-      </w:r>
-      <w:r>
-        <w:br/>
-      </w:r>
-      <w:r>
-        <w:t xml:space="preserve">(h) Gráficos de normalidade/coordenadas;</w:t>
-      </w:r>
-      <w:r>
-        <w:br/>
-      </w:r>
-      <w:r>
-        <w:t xml:space="preserve">(i) Binarização/binning de recursos;</w:t>
-      </w:r>
-      <w:r>
-        <w:br/>
-      </w:r>
-      <w:r>
-        <w:t xml:space="preserve">(j) Padronizar/faltar imputação/diagnosticar outliers; e</w:t>
-      </w:r>
-      <w:r>
-        <w:br/>
-      </w:r>
-      <w:r>
-        <w:t xml:space="preserve">(k) Relatório HTML usando rmarkdown/Shiny.</w:t>
-      </w:r>
-    </w:p>
-    <w:p>
-      <w:pPr>
-        <w:pStyle w:val="BodyText"/>
-      </w:pPr>
-      <w:r>
-        <w:t xml:space="preserve">[./figuras/Figura 3 - Tabela comparativa de pacotes EDA.jpg]</w:t>
-      </w:r>
-      <w:r>
-        <w:br/>
-      </w:r>
-      <w:r>
-        <w:t xml:space="preserve">Figura 3: Comparação do SmartEDA com os pacotes R disponíveis.</w:t>
-      </w:r>
-    </w:p>
-    <w:bookmarkEnd w:id="23"/>
-    <w:bookmarkStart w:id="24" w:name="conclusão"/>
-    <w:p>
-      <w:pPr>
-        <w:pStyle w:val="Heading3"/>
-      </w:pPr>
-      <w:r>
-        <w:t xml:space="preserve">Conclusão</w:t>
-      </w:r>
-    </w:p>
-    <w:p>
-      <w:pPr>
-        <w:pStyle w:val="FirstParagraph"/>
-      </w:pPr>
-      <w:r>
-        <w:t xml:space="preserve">A contribuição deste trabalho está no desenvolvimento de um novo pacote em R ou seja, SmartEDA para Análise Exploratória de Dados automatizada.</w:t>
-      </w:r>
-      <w:r>
-        <w:br/>
-      </w:r>
-      <w:r>
-        <w:t xml:space="preserve">O pacote SmartEDA ajuda na implementação da Análise Exploratória de Dados completa apenas executando a função em vez de escrever um código R demorado. Os usuários do SmartEDA podem automatizar todo o processo de EDA em qualquer conjunto de dados com funções fáceis de implementar e exportar relatórios de EDA que seguem as melhores práticas da indústria e da academia.</w:t>
-      </w:r>
-      <w:r>
-        <w:br/>
-      </w:r>
-      <w:r>
-        <w:t xml:space="preserve">O SmartEDA pode fornecer estatísticas resumidas junto com gráficos para variáveis numéricas e categóricas. Ele também fornece uma extensão para o pacote data.table que nenhum dos outros pacotes disponíveis no CRAN oferece.</w:t>
-      </w:r>
-      <w:r>
-        <w:br/>
-      </w:r>
-      <w:r>
-        <w:t xml:space="preserve">No geral, os principais benefícios do SmartEDA estão na economia de tempo de desenvolvimento, menor porcentagem de erros e reprodutibilidade.</w:t>
-      </w:r>
-      <w:r>
-        <w:br/>
-      </w:r>
-      <w:r>
-        <w:t xml:space="preserve">Em setembro de 2019, o pacote SmartEDA tinha mais de 6.000 downloads, o que indica sua aceitabilidade e maturidade nas estatísticas e na comunidade de aprendizado de máquina.</w:t>
-      </w:r>
-      <w:r>
-        <w:br/>
-      </w:r>
-      <w:r>
-        <w:t xml:space="preserve">Podemos ver na Figura 3 que a versão atual do SmartEDA possui quase todas as características desejadas mencionadas acima, exceto os pontos (h) e (i), ou seja, gráficos de normalidade e binning de recursos, respectivamente. Esses dois recursos seriam incorporados na próxima versão e estamos trabalhando nisso.</w:t>
-      </w:r>
-      <w:r>
-        <w:br/>
-      </w:r>
-      <w:r>
-        <w:t xml:space="preserve">No entanto, a funcionalidade exclusiva e mais forte fornecida pelo SmartEDA é o ponto (f), ou seja, uma extensão para o pacote data.table que nenhum dos outros pacotes oferece. Assim, o SmartEDA agrega valor devido à importância e popularidade do data.table entre os usuários do R para analisar grandes conjuntos de dados.</w:t>
-      </w:r>
-      <w:r>
-        <w:br/>
-      </w:r>
-      <w:r>
-        <w:t xml:space="preserve">A Figura 3 mostra que o SmartEDA é melhor do que quase todos os outros pacotes disponíveis no CRAN.</w:t>
-      </w:r>
-      <w:r>
-        <w:br/>
-      </w:r>
-      <w:r>
-        <w:t xml:space="preserve">O concorrente mais próximo do SmartEDA parece ser o pacote DataExplorer, mas este não possui os recursos de dataviz (b) e (f). Função para fornecer estatísticas de resumo para todas as variáveis numéricas e extensão para dados e para o acote data.table, respectivamente.</w:t>
-      </w:r>
-      <w:r>
-        <w:br/>
-      </w:r>
-      <w:r>
-        <w:t xml:space="preserve">Além disso, outra característica distintiva que o SmartEDA possui, mas nenhum dos outros pacotes semelhantes possuem, é a capacidade de exportar todos os gráficos em um pdf.</w:t>
-      </w:r>
-    </w:p>
-    <w:bookmarkEnd w:id="24"/>
-    <w:bookmarkStart w:id="26" w:name="disponibilidade"/>
-    <w:p>
-      <w:pPr>
-        <w:pStyle w:val="Heading3"/>
-      </w:pPr>
-      <w:r>
-        <w:t xml:space="preserve">Disponibilidade</w:t>
-      </w:r>
-    </w:p>
-    <w:p>
-      <w:pPr>
-        <w:pStyle w:val="FirstParagraph"/>
-      </w:pPr>
-      <w:r>
         <w:t xml:space="preserve">O software é distribuído sob uma LICENÇA de arquivo MIT + (Repositório: CRAN) e está disponível em</w:t>
       </w:r>
       <w:r>
         <w:t xml:space="preserve"> </w:t>
       </w:r>
-      <w:hyperlink r:id="rId25">
+      <w:hyperlink r:id="rId31">
         <w:r>
           <w:rPr>
             <w:rStyle w:val="Hyperlink"/>
@@ -1571,8 +1819,8 @@
         <w:t xml:space="preserve">.</w:t>
       </w:r>
     </w:p>
-    <w:bookmarkEnd w:id="26"/>
-    <w:bookmarkStart w:id="27" w:name="reconhecimentos"/>
+    <w:bookmarkEnd w:id="32"/>
+    <w:bookmarkStart w:id="33" w:name="reconhecimentos"/>
     <w:p>
       <w:pPr>
         <w:pStyle w:val="Heading3"/>
@@ -1589,8 +1837,8 @@
         <w:t xml:space="preserve">Queremos agradecer à VMware e à liderança do Enterprise and Data Analytics (EDA) por nos fornecer a infraestrutura e o suporte necessários para este trabalho. Somos gratos à comunidade R por sua aceitação e feedback para melhorar ainda mais nosso pacote.</w:t>
       </w:r>
     </w:p>
-    <w:bookmarkEnd w:id="27"/>
-    <w:bookmarkStart w:id="41" w:name="referências-bibliográficas"/>
+    <w:bookmarkEnd w:id="33"/>
+    <w:bookmarkStart w:id="47" w:name="referências-bibliográficas"/>
     <w:p>
       <w:pPr>
         <w:pStyle w:val="Heading3"/>
@@ -1615,7 +1863,7 @@
       <w:r>
         <w:t xml:space="preserve"> </w:t>
       </w:r>
-      <w:hyperlink r:id="rId28">
+      <w:hyperlink r:id="rId34">
         <w:r>
           <w:rPr>
             <w:rStyle w:val="Hyperlink"/>
@@ -1641,7 +1889,7 @@
       <w:r>
         <w:t xml:space="preserve">{</w:t>
       </w:r>
-      <w:hyperlink r:id="rId29">
+      <w:hyperlink r:id="rId35">
         <w:r>
           <w:rPr>
             <w:rStyle w:val="Hyperlink"/>
@@ -1664,7 +1912,7 @@
       <w:r>
         <w:t xml:space="preserve">from {</w:t>
       </w:r>
-      <w:hyperlink r:id="rId30">
+      <w:hyperlink r:id="rId36">
         <w:r>
           <w:rPr>
             <w:rStyle w:val="Hyperlink"/>
@@ -1681,7 +1929,7 @@
       <w:r>
         <w:t xml:space="preserve">Cui, B. (2018). DataExplorer: Data Explorer. Retrieved from {</w:t>
       </w:r>
-      <w:hyperlink r:id="rId31">
+      <w:hyperlink r:id="rId37">
         <w:r>
           <w:rPr>
             <w:rStyle w:val="Hyperlink"/>
@@ -1713,7 +1961,7 @@
       <w:r>
         <w:t xml:space="preserve"> </w:t>
       </w:r>
-      <w:hyperlink r:id="rId32">
+      <w:hyperlink r:id="rId38">
         <w:r>
           <w:rPr>
             <w:rStyle w:val="Hyperlink"/>
@@ -1727,7 +1975,7 @@
       <w:r>
         <w:t xml:space="preserve">Harrell et al. (2018). Hmisc: Harrell Miscellaneous. Retrieved from {</w:t>
       </w:r>
-      <w:hyperlink r:id="rId31">
+      <w:hyperlink r:id="rId37">
         <w:r>
           <w:rPr>
             <w:rStyle w:val="Hyperlink"/>
@@ -1759,7 +2007,7 @@
       <w:r>
         <w:t xml:space="preserve"> </w:t>
       </w:r>
-      <w:hyperlink r:id="rId33">
+      <w:hyperlink r:id="rId39">
         <w:r>
           <w:rPr>
             <w:rStyle w:val="Hyperlink"/>
@@ -1788,7 +2036,7 @@
       <w:r>
         <w:t xml:space="preserve"> </w:t>
       </w:r>
-      <w:hyperlink r:id="rId34">
+      <w:hyperlink r:id="rId40">
         <w:r>
           <w:rPr>
             <w:rStyle w:val="Hyperlink"/>
@@ -1832,7 +2080,7 @@
       <w:r>
         <w:t xml:space="preserve"> </w:t>
       </w:r>
-      <w:hyperlink r:id="rId35">
+      <w:hyperlink r:id="rId41">
         <w:r>
           <w:rPr>
             <w:rStyle w:val="Hyperlink"/>
@@ -1852,7 +2100,7 @@
       <w:r>
         <w:t xml:space="preserve">{</w:t>
       </w:r>
-      <w:hyperlink r:id="rId36">
+      <w:hyperlink r:id="rId42">
         <w:r>
           <w:rPr>
             <w:rStyle w:val="Hyperlink"/>
@@ -1878,7 +2126,7 @@
       <w:r>
         <w:t xml:space="preserve"> </w:t>
       </w:r>
-      <w:hyperlink r:id="rId37">
+      <w:hyperlink r:id="rId43">
         <w:r>
           <w:rPr>
             <w:rStyle w:val="Hyperlink"/>
@@ -1898,7 +2146,7 @@
       <w:r>
         <w:t xml:space="preserve">from {</w:t>
       </w:r>
-      <w:hyperlink r:id="rId38">
+      <w:hyperlink r:id="rId44">
         <w:r>
           <w:rPr>
             <w:rStyle w:val="Hyperlink"/>
@@ -1933,7 +2181,7 @@
       <w:r>
         <w:t xml:space="preserve"> </w:t>
       </w:r>
-      <w:hyperlink r:id="rId39">
+      <w:hyperlink r:id="rId45">
         <w:r>
           <w:rPr>
             <w:rStyle w:val="Hyperlink"/>
@@ -1962,7 +2210,7 @@
       <w:r>
         <w:t xml:space="preserve">and Explore the Data. Retrieved from {</w:t>
       </w:r>
-      <w:hyperlink r:id="rId40">
+      <w:hyperlink r:id="rId46">
         <w:r>
           <w:rPr>
             <w:rStyle w:val="Hyperlink"/>
@@ -1974,7 +2222,7 @@
         <w:t xml:space="preserve">}</w:t>
       </w:r>
     </w:p>
-    <w:bookmarkEnd w:id="41"/>
+    <w:bookmarkEnd w:id="47"/>
     <w:sectPr/>
   </w:body>
 </w:document>

</xml_diff>